<commit_message>
Fix modal forms and submit handlers across users, checkpoints, duty, and layout templates
</commit_message>
<xml_diff>
--- a/Patrol run time.docx
+++ b/Patrol run time.docx
@@ -922,7 +922,6 @@
         </w:rPr>
       </w:pPr>
       <w:proofErr w:type="spellStart"/>
-      <w:proofErr w:type="gramStart"/>
       <w:r>
         <w:rPr>
           <w:rFonts w:ascii="Consolas" w:eastAsia="Times New Roman" w:hAnsi="Consolas" w:cs="Courier New"/>
@@ -936,7 +935,6 @@
         <w:t>application.properties</w:t>
       </w:r>
       <w:proofErr w:type="spellEnd"/>
-      <w:proofErr w:type="gramEnd"/>
       <w:r>
         <w:rPr>
           <w:rFonts w:ascii="Segoe UI" w:eastAsia="Times New Roman" w:hAnsi="Segoe UI" w:cs="Segoe UI"/>
@@ -1875,7 +1873,6 @@
           <w:lang w:eastAsia="en-IN" w:bidi="hi-IN"/>
         </w:rPr>
       </w:pPr>
-      <w:proofErr w:type="gramStart"/>
       <w:r>
         <w:rPr>
           <w:rFonts w:ascii="Consolas" w:eastAsia="Times New Roman" w:hAnsi="Consolas" w:cs="Courier New"/>
@@ -1903,7 +1900,6 @@
         <w:t>supabase.sql</w:t>
       </w:r>
       <w:proofErr w:type="spellEnd"/>
-      <w:proofErr w:type="gramEnd"/>
       <w:r>
         <w:rPr>
           <w:rFonts w:ascii="Segoe UI" w:eastAsia="Times New Roman" w:hAnsi="Segoe UI" w:cs="Segoe UI"/>
@@ -2195,15 +2191,7 @@
         </w:rPr>
       </w:pPr>
       <w:r>
-        <w:t xml:space="preserve">  {{{{{{{{{{{{{</w:t>
-      </w:r>
-      <w:proofErr w:type="gramStart"/>
-      <w:r>
-        <w:t>{ Password</w:t>
-      </w:r>
-      <w:proofErr w:type="gramEnd"/>
-      <w:r>
-        <w:t xml:space="preserve"> </w:t>
+        <w:t xml:space="preserve">  {{{{{{{{{{{{{{ Password </w:t>
       </w:r>
       <w:proofErr w:type="spellStart"/>
       <w:r>
@@ -2280,8 +2268,6 @@
           <w:shd w:val="clear" w:color="auto" w:fill="3C3C3C"/>
         </w:rPr>
       </w:pPr>
-      <w:bookmarkStart w:id="0" w:name="_GoBack"/>
-      <w:bookmarkEnd w:id="0"/>
     </w:p>
     <w:p>
       <w:pPr>
@@ -2297,6 +2283,7 @@
           <w:shd w:val="clear" w:color="auto" w:fill="3C3C3C"/>
         </w:rPr>
       </w:pPr>
+      <w:proofErr w:type="spellStart"/>
       <w:r>
         <w:rPr>
           <w:rStyle w:val="HTMLCode"/>
@@ -2309,10 +2296,1552 @@
           <w:bdr w:val="single" w:sz="2" w:space="0" w:color="auto" w:frame="1"/>
           <w:shd w:val="clear" w:color="auto" w:fill="3C3C3C"/>
         </w:rPr>
-        <w:t>Patrol@1234.01</w:t>
+        <w:t>Github</w:t>
+      </w:r>
+      <w:proofErr w:type="spellEnd"/>
+      <w:r>
+        <w:rPr>
+          <w:rStyle w:val="HTMLCode"/>
+          <w:rFonts w:ascii="Consolas" w:eastAsiaTheme="minorHAnsi" w:hAnsi="Consolas"/>
+          <w:b/>
+          <w:bCs/>
+          <w:color w:val="D0D0D0"/>
+          <w:sz w:val="18"/>
+          <w:szCs w:val="18"/>
+          <w:bdr w:val="single" w:sz="2" w:space="0" w:color="auto" w:frame="1"/>
+          <w:shd w:val="clear" w:color="auto" w:fill="3C3C3C"/>
+        </w:rPr>
+        <w:t xml:space="preserve"> password  (</w:t>
+      </w:r>
+      <w:hyperlink r:id="rId8" w:history="1">
+        <w:r>
+          <w:rPr>
+            <w:rStyle w:val="Hyperlink"/>
+            <w:rFonts w:ascii="Consolas" w:hAnsi="Consolas" w:cs="Courier New"/>
+            <w:b/>
+            <w:bCs/>
+            <w:sz w:val="18"/>
+            <w:szCs w:val="18"/>
+            <w:bdr w:val="single" w:sz="2" w:space="0" w:color="auto" w:frame="1"/>
+            <w:shd w:val="clear" w:color="auto" w:fill="3C3C3C"/>
+          </w:rPr>
+          <w:t>Patrol@1234.01</w:t>
+        </w:r>
+      </w:hyperlink>
+      <w:r>
+        <w:rPr>
+          <w:rStyle w:val="HTMLCode"/>
+          <w:rFonts w:ascii="Consolas" w:eastAsiaTheme="minorHAnsi" w:hAnsi="Consolas"/>
+          <w:b/>
+          <w:bCs/>
+          <w:color w:val="D0D0D0"/>
+          <w:sz w:val="18"/>
+          <w:szCs w:val="18"/>
+          <w:bdr w:val="single" w:sz="2" w:space="0" w:color="auto" w:frame="1"/>
+          <w:shd w:val="clear" w:color="auto" w:fill="3C3C3C"/>
+        </w:rPr>
+        <w:t>)</w:t>
+      </w:r>
+    </w:p>
+    <w:p>
+      <w:pPr>
+        <w:rPr>
+          <w:rStyle w:val="HTMLCode"/>
+          <w:rFonts w:ascii="Consolas" w:eastAsiaTheme="minorHAnsi" w:hAnsi="Consolas"/>
+          <w:b/>
+          <w:bCs/>
+          <w:color w:val="D0D0D0"/>
+          <w:sz w:val="18"/>
+          <w:szCs w:val="18"/>
+          <w:bdr w:val="single" w:sz="2" w:space="0" w:color="auto" w:frame="1"/>
+          <w:shd w:val="clear" w:color="auto" w:fill="3C3C3C"/>
+        </w:rPr>
+      </w:pPr>
+    </w:p>
+    <w:p>
+      <w:pPr>
+        <w:rPr>
+          <w:rStyle w:val="HTMLCode"/>
+          <w:rFonts w:ascii="Consolas" w:eastAsiaTheme="minorHAnsi" w:hAnsi="Consolas"/>
+          <w:b/>
+          <w:bCs/>
+          <w:color w:val="D0D0D0"/>
+          <w:sz w:val="18"/>
+          <w:szCs w:val="18"/>
+          <w:bdr w:val="single" w:sz="2" w:space="0" w:color="auto" w:frame="1"/>
+          <w:shd w:val="clear" w:color="auto" w:fill="3C3C3C"/>
+        </w:rPr>
+      </w:pPr>
+      <w:r>
+        <w:rPr>
+          <w:rStyle w:val="HTMLCode"/>
+          <w:rFonts w:ascii="Consolas" w:eastAsiaTheme="minorHAnsi" w:hAnsi="Consolas"/>
+          <w:b/>
+          <w:bCs/>
+          <w:color w:val="D0D0D0"/>
+          <w:sz w:val="18"/>
+          <w:szCs w:val="18"/>
+          <w:bdr w:val="single" w:sz="2" w:space="0" w:color="auto" w:frame="1"/>
+          <w:shd w:val="clear" w:color="auto" w:fill="3C3C3C"/>
+        </w:rPr>
+        <w:t>https://github.com/buxarinventorymanagement-jpg/Patrol-Tracker</w:t>
       </w:r>
     </w:p>
     <w:p/>
+    <w:p/>
+    <w:p>
+      <w:hyperlink r:id="rId9" w:history="1">
+        <w:r>
+          <w:rPr>
+            <w:rStyle w:val="Hyperlink"/>
+          </w:rPr>
+          <w:t>https://localhost8080</w:t>
+        </w:r>
+      </w:hyperlink>
+    </w:p>
+    <w:p/>
+    <w:p>
+      <w:pPr>
+        <w:pStyle w:val="NormalWeb"/>
+        <w:pBdr>
+          <w:top w:val="single" w:sz="2" w:space="0" w:color="auto"/>
+          <w:left w:val="single" w:sz="2" w:space="0" w:color="auto"/>
+          <w:bottom w:val="single" w:sz="2" w:space="0" w:color="auto"/>
+          <w:right w:val="single" w:sz="2" w:space="0" w:color="auto"/>
+        </w:pBdr>
+        <w:shd w:val="clear" w:color="auto" w:fill="181818"/>
+        <w:spacing w:before="0" w:beforeAutospacing="0" w:after="0" w:afterAutospacing="0"/>
+        <w:rPr>
+          <w:rFonts w:ascii="Segoe UI" w:hAnsi="Segoe UI" w:cs="Segoe UI"/>
+          <w:color w:val="CCCCCC"/>
+          <w:sz w:val="20"/>
+          <w:szCs w:val="20"/>
+        </w:rPr>
+      </w:pPr>
+      <w:r>
+        <w:rPr>
+          <w:rFonts w:ascii="Segoe UI" w:hAnsi="Segoe UI" w:cs="Segoe UI"/>
+          <w:color w:val="CCCCCC"/>
+          <w:sz w:val="20"/>
+          <w:szCs w:val="20"/>
+        </w:rPr>
+        <w:t xml:space="preserve">Application </w:t>
+      </w:r>
+      <w:proofErr w:type="spellStart"/>
+      <w:r>
+        <w:rPr>
+          <w:rFonts w:ascii="Segoe UI" w:hAnsi="Segoe UI" w:cs="Segoe UI"/>
+          <w:color w:val="CCCCCC"/>
+          <w:sz w:val="20"/>
+          <w:szCs w:val="20"/>
+        </w:rPr>
+        <w:t>ab</w:t>
+      </w:r>
+      <w:proofErr w:type="spellEnd"/>
+      <w:r>
+        <w:rPr>
+          <w:rFonts w:ascii="Segoe UI" w:hAnsi="Segoe UI" w:cs="Segoe UI"/>
+          <w:color w:val="CCCCCC"/>
+          <w:sz w:val="20"/>
+          <w:szCs w:val="20"/>
+        </w:rPr>
+        <w:t xml:space="preserve"> successfully </w:t>
+      </w:r>
+      <w:r>
+        <w:rPr>
+          <w:rStyle w:val="Strong"/>
+          <w:rFonts w:ascii="Segoe UI" w:hAnsi="Segoe UI" w:cs="Segoe UI"/>
+          <w:color w:val="CCCCCC"/>
+          <w:sz w:val="20"/>
+          <w:szCs w:val="20"/>
+          <w:bdr w:val="single" w:sz="2" w:space="0" w:color="auto" w:frame="1"/>
+        </w:rPr>
+        <w:t>Start (RUNNING)</w:t>
+      </w:r>
+      <w:r>
+        <w:rPr>
+          <w:rFonts w:ascii="Segoe UI" w:hAnsi="Segoe UI" w:cs="Segoe UI"/>
+          <w:color w:val="CCCCCC"/>
+          <w:sz w:val="20"/>
+          <w:szCs w:val="20"/>
+        </w:rPr>
+        <w:t> </w:t>
+      </w:r>
+      <w:proofErr w:type="spellStart"/>
+      <w:r>
+        <w:rPr>
+          <w:rFonts w:ascii="Segoe UI" w:hAnsi="Segoe UI" w:cs="Segoe UI"/>
+          <w:color w:val="CCCCCC"/>
+          <w:sz w:val="20"/>
+          <w:szCs w:val="20"/>
+        </w:rPr>
+        <w:t>ho</w:t>
+      </w:r>
+      <w:proofErr w:type="spellEnd"/>
+      <w:r>
+        <w:rPr>
+          <w:rFonts w:ascii="Segoe UI" w:hAnsi="Segoe UI" w:cs="Segoe UI"/>
+          <w:color w:val="CCCCCC"/>
+          <w:sz w:val="20"/>
+          <w:szCs w:val="20"/>
+        </w:rPr>
+        <w:t xml:space="preserve"> </w:t>
+      </w:r>
+      <w:proofErr w:type="spellStart"/>
+      <w:r>
+        <w:rPr>
+          <w:rFonts w:ascii="Segoe UI" w:hAnsi="Segoe UI" w:cs="Segoe UI"/>
+          <w:color w:val="CCCCCC"/>
+          <w:sz w:val="20"/>
+          <w:szCs w:val="20"/>
+        </w:rPr>
+        <w:t>chuki</w:t>
+      </w:r>
+      <w:proofErr w:type="spellEnd"/>
+      <w:r>
+        <w:rPr>
+          <w:rFonts w:ascii="Segoe UI" w:hAnsi="Segoe UI" w:cs="Segoe UI"/>
+          <w:color w:val="CCCCCC"/>
+          <w:sz w:val="20"/>
+          <w:szCs w:val="20"/>
+        </w:rPr>
+        <w:t xml:space="preserve"> </w:t>
+      </w:r>
+      <w:proofErr w:type="spellStart"/>
+      <w:r>
+        <w:rPr>
+          <w:rFonts w:ascii="Segoe UI" w:hAnsi="Segoe UI" w:cs="Segoe UI"/>
+          <w:color w:val="CCCCCC"/>
+          <w:sz w:val="20"/>
+          <w:szCs w:val="20"/>
+        </w:rPr>
+        <w:t>hai</w:t>
+      </w:r>
+      <w:proofErr w:type="spellEnd"/>
+      <w:r>
+        <w:rPr>
+          <w:rFonts w:ascii="Segoe UI" w:hAnsi="Segoe UI" w:cs="Segoe UI"/>
+          <w:color w:val="CCCCCC"/>
+          <w:sz w:val="20"/>
+          <w:szCs w:val="20"/>
+        </w:rPr>
+        <w:t>! 🚀</w:t>
+      </w:r>
+    </w:p>
+    <w:p>
+      <w:pPr>
+        <w:pStyle w:val="NormalWeb"/>
+        <w:pBdr>
+          <w:top w:val="single" w:sz="2" w:space="0" w:color="auto"/>
+          <w:left w:val="single" w:sz="2" w:space="0" w:color="auto"/>
+          <w:bottom w:val="single" w:sz="2" w:space="0" w:color="auto"/>
+          <w:right w:val="single" w:sz="2" w:space="0" w:color="auto"/>
+        </w:pBdr>
+        <w:shd w:val="clear" w:color="auto" w:fill="181818"/>
+        <w:spacing w:before="0" w:beforeAutospacing="0" w:after="0" w:afterAutospacing="0"/>
+        <w:rPr>
+          <w:rFonts w:ascii="Segoe UI" w:hAnsi="Segoe UI" w:cs="Segoe UI"/>
+          <w:color w:val="CCCCCC"/>
+          <w:sz w:val="20"/>
+          <w:szCs w:val="20"/>
+        </w:rPr>
+      </w:pPr>
+      <w:proofErr w:type="spellStart"/>
+      <w:r>
+        <w:rPr>
+          <w:rFonts w:ascii="Segoe UI" w:hAnsi="Segoe UI" w:cs="Segoe UI"/>
+          <w:color w:val="CCCCCC"/>
+          <w:sz w:val="20"/>
+          <w:szCs w:val="20"/>
+        </w:rPr>
+        <w:t>Aapke</w:t>
+      </w:r>
+      <w:proofErr w:type="spellEnd"/>
+      <w:r>
+        <w:rPr>
+          <w:rFonts w:ascii="Segoe UI" w:hAnsi="Segoe UI" w:cs="Segoe UI"/>
+          <w:color w:val="CCCCCC"/>
+          <w:sz w:val="20"/>
+          <w:szCs w:val="20"/>
+        </w:rPr>
+        <w:t xml:space="preserve"> screenshot me 2 </w:t>
+      </w:r>
+      <w:proofErr w:type="spellStart"/>
+      <w:r>
+        <w:rPr>
+          <w:rFonts w:ascii="Segoe UI" w:hAnsi="Segoe UI" w:cs="Segoe UI"/>
+          <w:color w:val="CCCCCC"/>
+          <w:sz w:val="20"/>
+          <w:szCs w:val="20"/>
+        </w:rPr>
+        <w:t>wajah</w:t>
+      </w:r>
+      <w:proofErr w:type="spellEnd"/>
+      <w:r>
+        <w:rPr>
+          <w:rFonts w:ascii="Segoe UI" w:hAnsi="Segoe UI" w:cs="Segoe UI"/>
+          <w:color w:val="CCCCCC"/>
+          <w:sz w:val="20"/>
+          <w:szCs w:val="20"/>
+        </w:rPr>
+        <w:t xml:space="preserve"> se page load </w:t>
+      </w:r>
+      <w:proofErr w:type="spellStart"/>
+      <w:r>
+        <w:rPr>
+          <w:rFonts w:ascii="Segoe UI" w:hAnsi="Segoe UI" w:cs="Segoe UI"/>
+          <w:color w:val="CCCCCC"/>
+          <w:sz w:val="20"/>
+          <w:szCs w:val="20"/>
+        </w:rPr>
+        <w:t>nahi</w:t>
+      </w:r>
+      <w:proofErr w:type="spellEnd"/>
+      <w:r>
+        <w:rPr>
+          <w:rFonts w:ascii="Segoe UI" w:hAnsi="Segoe UI" w:cs="Segoe UI"/>
+          <w:color w:val="CCCCCC"/>
+          <w:sz w:val="20"/>
+          <w:szCs w:val="20"/>
+        </w:rPr>
+        <w:t xml:space="preserve"> </w:t>
+      </w:r>
+      <w:proofErr w:type="spellStart"/>
+      <w:r>
+        <w:rPr>
+          <w:rFonts w:ascii="Segoe UI" w:hAnsi="Segoe UI" w:cs="Segoe UI"/>
+          <w:color w:val="CCCCCC"/>
+          <w:sz w:val="20"/>
+          <w:szCs w:val="20"/>
+        </w:rPr>
+        <w:t>ho</w:t>
+      </w:r>
+      <w:proofErr w:type="spellEnd"/>
+      <w:r>
+        <w:rPr>
+          <w:rFonts w:ascii="Segoe UI" w:hAnsi="Segoe UI" w:cs="Segoe UI"/>
+          <w:color w:val="CCCCCC"/>
+          <w:sz w:val="20"/>
+          <w:szCs w:val="20"/>
+        </w:rPr>
+        <w:t xml:space="preserve"> </w:t>
+      </w:r>
+      <w:proofErr w:type="spellStart"/>
+      <w:r>
+        <w:rPr>
+          <w:rFonts w:ascii="Segoe UI" w:hAnsi="Segoe UI" w:cs="Segoe UI"/>
+          <w:color w:val="CCCCCC"/>
+          <w:sz w:val="20"/>
+          <w:szCs w:val="20"/>
+        </w:rPr>
+        <w:t>raha</w:t>
+      </w:r>
+      <w:proofErr w:type="spellEnd"/>
+      <w:r>
+        <w:rPr>
+          <w:rFonts w:ascii="Segoe UI" w:hAnsi="Segoe UI" w:cs="Segoe UI"/>
+          <w:color w:val="CCCCCC"/>
+          <w:sz w:val="20"/>
+          <w:szCs w:val="20"/>
+        </w:rPr>
+        <w:t xml:space="preserve"> </w:t>
+      </w:r>
+      <w:proofErr w:type="spellStart"/>
+      <w:r>
+        <w:rPr>
+          <w:rFonts w:ascii="Segoe UI" w:hAnsi="Segoe UI" w:cs="Segoe UI"/>
+          <w:color w:val="CCCCCC"/>
+          <w:sz w:val="20"/>
+          <w:szCs w:val="20"/>
+        </w:rPr>
+        <w:t>tha</w:t>
+      </w:r>
+      <w:proofErr w:type="spellEnd"/>
+      <w:r>
+        <w:rPr>
+          <w:rFonts w:ascii="Segoe UI" w:hAnsi="Segoe UI" w:cs="Segoe UI"/>
+          <w:color w:val="CCCCCC"/>
+          <w:sz w:val="20"/>
+          <w:szCs w:val="20"/>
+        </w:rPr>
+        <w:t>:</w:t>
+      </w:r>
+    </w:p>
+    <w:p>
+      <w:pPr>
+        <w:rPr>
+          <w:rFonts w:ascii="Times New Roman" w:hAnsi="Times New Roman" w:cs="Times New Roman"/>
+          <w:sz w:val="24"/>
+          <w:szCs w:val="24"/>
+        </w:rPr>
+      </w:pPr>
+      <w:r>
+        <w:pict>
+          <v:rect id="_x0000_i1028" style="width:180pt;height:.75pt" o:hrpct="0" o:hralign="center" o:hrstd="t" o:hr="t" fillcolor="#a0a0a0" stroked="f"/>
+        </w:pict>
+      </w:r>
+    </w:p>
+    <w:p>
+      <w:pPr>
+        <w:pStyle w:val="Heading3"/>
+        <w:pBdr>
+          <w:top w:val="single" w:sz="2" w:space="0" w:color="auto"/>
+          <w:left w:val="single" w:sz="2" w:space="0" w:color="auto"/>
+          <w:bottom w:val="single" w:sz="2" w:space="0" w:color="auto"/>
+          <w:right w:val="single" w:sz="2" w:space="0" w:color="auto"/>
+        </w:pBdr>
+        <w:shd w:val="clear" w:color="auto" w:fill="181818"/>
+        <w:rPr>
+          <w:rFonts w:ascii="Segoe UI" w:hAnsi="Segoe UI" w:cs="Segoe UI"/>
+          <w:b w:val="0"/>
+          <w:bCs w:val="0"/>
+          <w:color w:val="CCCCCC"/>
+        </w:rPr>
+      </w:pPr>
+      <w:r>
+        <w:rPr>
+          <w:rFonts w:ascii="Segoe UI" w:hAnsi="Segoe UI" w:cs="Segoe UI"/>
+          <w:b w:val="0"/>
+          <w:bCs w:val="0"/>
+          <w:color w:val="CCCCCC"/>
+        </w:rPr>
+        <w:t xml:space="preserve">1. URL me Typo </w:t>
+      </w:r>
+      <w:proofErr w:type="spellStart"/>
+      <w:r>
+        <w:rPr>
+          <w:rFonts w:ascii="Segoe UI" w:hAnsi="Segoe UI" w:cs="Segoe UI"/>
+          <w:b w:val="0"/>
+          <w:bCs w:val="0"/>
+          <w:color w:val="CCCCCC"/>
+        </w:rPr>
+        <w:t>tha</w:t>
+      </w:r>
+      <w:proofErr w:type="spellEnd"/>
+      <w:r>
+        <w:rPr>
+          <w:rFonts w:ascii="Segoe UI" w:hAnsi="Segoe UI" w:cs="Segoe UI"/>
+          <w:b w:val="0"/>
+          <w:bCs w:val="0"/>
+          <w:color w:val="CCCCCC"/>
+        </w:rPr>
+        <w:t xml:space="preserve"> (</w:t>
+      </w:r>
+      <w:r>
+        <w:rPr>
+          <w:rStyle w:val="HTMLCode"/>
+          <w:rFonts w:ascii="Consolas" w:hAnsi="Consolas"/>
+          <w:b w:val="0"/>
+          <w:bCs w:val="0"/>
+          <w:color w:val="D0D0D0"/>
+          <w:sz w:val="24"/>
+          <w:szCs w:val="24"/>
+          <w:bdr w:val="single" w:sz="2" w:space="0" w:color="auto" w:frame="1"/>
+          <w:shd w:val="clear" w:color="auto" w:fill="3C3C3C"/>
+        </w:rPr>
+        <w:t>:</w:t>
+      </w:r>
+      <w:r>
+        <w:rPr>
+          <w:rFonts w:ascii="Segoe UI" w:hAnsi="Segoe UI" w:cs="Segoe UI"/>
+          <w:b w:val="0"/>
+          <w:bCs w:val="0"/>
+          <w:color w:val="CCCCCC"/>
+        </w:rPr>
+        <w:t xml:space="preserve"> missing </w:t>
+      </w:r>
+      <w:proofErr w:type="spellStart"/>
+      <w:r>
+        <w:rPr>
+          <w:rFonts w:ascii="Segoe UI" w:hAnsi="Segoe UI" w:cs="Segoe UI"/>
+          <w:b w:val="0"/>
+          <w:bCs w:val="0"/>
+          <w:color w:val="CCCCCC"/>
+        </w:rPr>
+        <w:t>tha</w:t>
+      </w:r>
+      <w:proofErr w:type="spellEnd"/>
+      <w:r>
+        <w:rPr>
+          <w:rFonts w:ascii="Segoe UI" w:hAnsi="Segoe UI" w:cs="Segoe UI"/>
+          <w:b w:val="0"/>
+          <w:bCs w:val="0"/>
+          <w:color w:val="CCCCCC"/>
+        </w:rPr>
+        <w:t>)</w:t>
+      </w:r>
+    </w:p>
+    <w:p>
+      <w:pPr>
+        <w:pStyle w:val="NormalWeb"/>
+        <w:pBdr>
+          <w:top w:val="single" w:sz="2" w:space="0" w:color="auto"/>
+          <w:left w:val="single" w:sz="2" w:space="0" w:color="auto"/>
+          <w:bottom w:val="single" w:sz="2" w:space="0" w:color="auto"/>
+          <w:right w:val="single" w:sz="2" w:space="0" w:color="auto"/>
+        </w:pBdr>
+        <w:shd w:val="clear" w:color="auto" w:fill="181818"/>
+        <w:spacing w:before="0" w:beforeAutospacing="0" w:after="0" w:afterAutospacing="0"/>
+        <w:rPr>
+          <w:rFonts w:ascii="Segoe UI" w:hAnsi="Segoe UI" w:cs="Segoe UI"/>
+          <w:color w:val="CCCCCC"/>
+          <w:sz w:val="20"/>
+          <w:szCs w:val="20"/>
+        </w:rPr>
+      </w:pPr>
+      <w:r>
+        <w:rPr>
+          <w:rFonts w:ascii="Segoe UI" w:hAnsi="Segoe UI" w:cs="Segoe UI"/>
+          <w:color w:val="CCCCCC"/>
+          <w:sz w:val="20"/>
+          <w:szCs w:val="20"/>
+        </w:rPr>
+        <w:t xml:space="preserve">Browser </w:t>
+      </w:r>
+      <w:proofErr w:type="spellStart"/>
+      <w:r>
+        <w:rPr>
+          <w:rFonts w:ascii="Segoe UI" w:hAnsi="Segoe UI" w:cs="Segoe UI"/>
+          <w:color w:val="CCCCCC"/>
+          <w:sz w:val="20"/>
+          <w:szCs w:val="20"/>
+        </w:rPr>
+        <w:t>ke</w:t>
+      </w:r>
+      <w:proofErr w:type="spellEnd"/>
+      <w:r>
+        <w:rPr>
+          <w:rFonts w:ascii="Segoe UI" w:hAnsi="Segoe UI" w:cs="Segoe UI"/>
+          <w:color w:val="CCCCCC"/>
+          <w:sz w:val="20"/>
+          <w:szCs w:val="20"/>
+        </w:rPr>
+        <w:t xml:space="preserve"> address bar me </w:t>
+      </w:r>
+      <w:r>
+        <w:rPr>
+          <w:rStyle w:val="HTMLCode"/>
+          <w:rFonts w:ascii="Consolas" w:hAnsi="Consolas"/>
+          <w:b/>
+          <w:bCs/>
+          <w:color w:val="D0D0D0"/>
+          <w:sz w:val="18"/>
+          <w:szCs w:val="18"/>
+          <w:bdr w:val="single" w:sz="2" w:space="0" w:color="auto" w:frame="1"/>
+          <w:shd w:val="clear" w:color="auto" w:fill="3C3C3C"/>
+        </w:rPr>
+        <w:t>localhost8080/</w:t>
+      </w:r>
+      <w:r>
+        <w:rPr>
+          <w:rFonts w:ascii="Segoe UI" w:hAnsi="Segoe UI" w:cs="Segoe UI"/>
+          <w:color w:val="CCCCCC"/>
+          <w:sz w:val="20"/>
+          <w:szCs w:val="20"/>
+        </w:rPr>
+        <w:t xml:space="preserve"> type </w:t>
+      </w:r>
+      <w:proofErr w:type="spellStart"/>
+      <w:r>
+        <w:rPr>
+          <w:rFonts w:ascii="Segoe UI" w:hAnsi="Segoe UI" w:cs="Segoe UI"/>
+          <w:color w:val="CCCCCC"/>
+          <w:sz w:val="20"/>
+          <w:szCs w:val="20"/>
+        </w:rPr>
+        <w:t>hua</w:t>
+      </w:r>
+      <w:proofErr w:type="spellEnd"/>
+      <w:r>
+        <w:rPr>
+          <w:rFonts w:ascii="Segoe UI" w:hAnsi="Segoe UI" w:cs="Segoe UI"/>
+          <w:color w:val="CCCCCC"/>
+          <w:sz w:val="20"/>
+          <w:szCs w:val="20"/>
+        </w:rPr>
+        <w:t xml:space="preserve"> </w:t>
+      </w:r>
+      <w:proofErr w:type="spellStart"/>
+      <w:r>
+        <w:rPr>
+          <w:rFonts w:ascii="Segoe UI" w:hAnsi="Segoe UI" w:cs="Segoe UI"/>
+          <w:color w:val="CCCCCC"/>
+          <w:sz w:val="20"/>
+          <w:szCs w:val="20"/>
+        </w:rPr>
+        <w:t>tha</w:t>
+      </w:r>
+      <w:proofErr w:type="spellEnd"/>
+      <w:r>
+        <w:rPr>
+          <w:rFonts w:ascii="Segoe UI" w:hAnsi="Segoe UI" w:cs="Segoe UI"/>
+          <w:color w:val="CCCCCC"/>
+          <w:sz w:val="20"/>
+          <w:szCs w:val="20"/>
+        </w:rPr>
+        <w:t>.</w:t>
+      </w:r>
+    </w:p>
+    <w:p>
+      <w:pPr>
+        <w:pStyle w:val="NormalWeb"/>
+        <w:pBdr>
+          <w:top w:val="single" w:sz="2" w:space="0" w:color="auto"/>
+          <w:left w:val="single" w:sz="2" w:space="0" w:color="auto"/>
+          <w:bottom w:val="single" w:sz="2" w:space="0" w:color="auto"/>
+          <w:right w:val="single" w:sz="2" w:space="0" w:color="auto"/>
+        </w:pBdr>
+        <w:shd w:val="clear" w:color="auto" w:fill="181818"/>
+        <w:spacing w:before="0" w:beforeAutospacing="0" w:after="0" w:afterAutospacing="0"/>
+        <w:rPr>
+          <w:rFonts w:ascii="Segoe UI" w:hAnsi="Segoe UI" w:cs="Segoe UI"/>
+          <w:color w:val="CCCCCC"/>
+          <w:sz w:val="20"/>
+          <w:szCs w:val="20"/>
+        </w:rPr>
+      </w:pPr>
+      <w:r>
+        <w:rPr>
+          <w:rFonts w:ascii="Segoe UI" w:hAnsi="Segoe UI" w:cs="Segoe UI"/>
+          <w:color w:val="CCCCCC"/>
+          <w:sz w:val="20"/>
+          <w:szCs w:val="20"/>
+        </w:rPr>
+        <w:t>👉 Correct URL me </w:t>
+      </w:r>
+      <w:proofErr w:type="spellStart"/>
+      <w:r>
+        <w:rPr>
+          <w:rStyle w:val="HTMLCode"/>
+          <w:rFonts w:ascii="Consolas" w:hAnsi="Consolas"/>
+          <w:b/>
+          <w:bCs/>
+          <w:color w:val="D0D0D0"/>
+          <w:sz w:val="18"/>
+          <w:szCs w:val="18"/>
+          <w:bdr w:val="single" w:sz="2" w:space="0" w:color="auto" w:frame="1"/>
+          <w:shd w:val="clear" w:color="auto" w:fill="3C3C3C"/>
+        </w:rPr>
+        <w:t>localhost</w:t>
+      </w:r>
+      <w:proofErr w:type="spellEnd"/>
+      <w:r>
+        <w:rPr>
+          <w:rStyle w:val="Strong"/>
+          <w:rFonts w:ascii="Segoe UI" w:hAnsi="Segoe UI" w:cs="Segoe UI"/>
+          <w:color w:val="CCCCCC"/>
+          <w:sz w:val="20"/>
+          <w:szCs w:val="20"/>
+          <w:bdr w:val="single" w:sz="2" w:space="0" w:color="auto" w:frame="1"/>
+        </w:rPr>
+        <w:t> </w:t>
+      </w:r>
+      <w:proofErr w:type="spellStart"/>
+      <w:r>
+        <w:rPr>
+          <w:rStyle w:val="Strong"/>
+          <w:rFonts w:ascii="Segoe UI" w:hAnsi="Segoe UI" w:cs="Segoe UI"/>
+          <w:color w:val="CCCCCC"/>
+          <w:sz w:val="20"/>
+          <w:szCs w:val="20"/>
+          <w:bdr w:val="single" w:sz="2" w:space="0" w:color="auto" w:frame="1"/>
+        </w:rPr>
+        <w:t>aur</w:t>
+      </w:r>
+      <w:proofErr w:type="spellEnd"/>
+      <w:r>
+        <w:rPr>
+          <w:rStyle w:val="Strong"/>
+          <w:rFonts w:ascii="Segoe UI" w:hAnsi="Segoe UI" w:cs="Segoe UI"/>
+          <w:color w:val="CCCCCC"/>
+          <w:sz w:val="20"/>
+          <w:szCs w:val="20"/>
+          <w:bdr w:val="single" w:sz="2" w:space="0" w:color="auto" w:frame="1"/>
+        </w:rPr>
+        <w:t> </w:t>
+      </w:r>
+      <w:r>
+        <w:rPr>
+          <w:rStyle w:val="HTMLCode"/>
+          <w:rFonts w:ascii="Consolas" w:hAnsi="Consolas"/>
+          <w:b/>
+          <w:bCs/>
+          <w:color w:val="D0D0D0"/>
+          <w:sz w:val="18"/>
+          <w:szCs w:val="18"/>
+          <w:bdr w:val="single" w:sz="2" w:space="0" w:color="auto" w:frame="1"/>
+          <w:shd w:val="clear" w:color="auto" w:fill="3C3C3C"/>
+        </w:rPr>
+        <w:t>8080</w:t>
+      </w:r>
+      <w:r>
+        <w:rPr>
+          <w:rStyle w:val="Strong"/>
+          <w:rFonts w:ascii="Segoe UI" w:hAnsi="Segoe UI" w:cs="Segoe UI"/>
+          <w:color w:val="CCCCCC"/>
+          <w:sz w:val="20"/>
+          <w:szCs w:val="20"/>
+          <w:bdr w:val="single" w:sz="2" w:space="0" w:color="auto" w:frame="1"/>
+        </w:rPr>
+        <w:t> </w:t>
+      </w:r>
+      <w:proofErr w:type="spellStart"/>
+      <w:r>
+        <w:rPr>
+          <w:rStyle w:val="Strong"/>
+          <w:rFonts w:ascii="Segoe UI" w:hAnsi="Segoe UI" w:cs="Segoe UI"/>
+          <w:color w:val="CCCCCC"/>
+          <w:sz w:val="20"/>
+          <w:szCs w:val="20"/>
+          <w:bdr w:val="single" w:sz="2" w:space="0" w:color="auto" w:frame="1"/>
+        </w:rPr>
+        <w:t>ke</w:t>
+      </w:r>
+      <w:proofErr w:type="spellEnd"/>
+      <w:r>
+        <w:rPr>
+          <w:rStyle w:val="Strong"/>
+          <w:rFonts w:ascii="Segoe UI" w:hAnsi="Segoe UI" w:cs="Segoe UI"/>
+          <w:color w:val="CCCCCC"/>
+          <w:sz w:val="20"/>
+          <w:szCs w:val="20"/>
+          <w:bdr w:val="single" w:sz="2" w:space="0" w:color="auto" w:frame="1"/>
+        </w:rPr>
+        <w:t xml:space="preserve"> beech me colon </w:t>
+      </w:r>
+      <w:r>
+        <w:rPr>
+          <w:rStyle w:val="HTMLCode"/>
+          <w:rFonts w:ascii="Consolas" w:hAnsi="Consolas"/>
+          <w:b/>
+          <w:bCs/>
+          <w:color w:val="D0D0D0"/>
+          <w:sz w:val="18"/>
+          <w:szCs w:val="18"/>
+          <w:bdr w:val="single" w:sz="2" w:space="0" w:color="auto" w:frame="1"/>
+          <w:shd w:val="clear" w:color="auto" w:fill="3C3C3C"/>
+        </w:rPr>
+        <w:t>:</w:t>
+      </w:r>
+      <w:r>
+        <w:rPr>
+          <w:rStyle w:val="Strong"/>
+          <w:rFonts w:ascii="Segoe UI" w:hAnsi="Segoe UI" w:cs="Segoe UI"/>
+          <w:color w:val="CCCCCC"/>
+          <w:sz w:val="20"/>
+          <w:szCs w:val="20"/>
+          <w:bdr w:val="single" w:sz="2" w:space="0" w:color="auto" w:frame="1"/>
+        </w:rPr>
+        <w:t> </w:t>
+      </w:r>
+      <w:proofErr w:type="spellStart"/>
+      <w:r>
+        <w:rPr>
+          <w:rStyle w:val="Strong"/>
+          <w:rFonts w:ascii="Segoe UI" w:hAnsi="Segoe UI" w:cs="Segoe UI"/>
+          <w:color w:val="CCCCCC"/>
+          <w:sz w:val="20"/>
+          <w:szCs w:val="20"/>
+          <w:bdr w:val="single" w:sz="2" w:space="0" w:color="auto" w:frame="1"/>
+        </w:rPr>
+        <w:t>hona</w:t>
+      </w:r>
+      <w:proofErr w:type="spellEnd"/>
+      <w:r>
+        <w:rPr>
+          <w:rStyle w:val="Strong"/>
+          <w:rFonts w:ascii="Segoe UI" w:hAnsi="Segoe UI" w:cs="Segoe UI"/>
+          <w:color w:val="CCCCCC"/>
+          <w:sz w:val="20"/>
+          <w:szCs w:val="20"/>
+          <w:bdr w:val="single" w:sz="2" w:space="0" w:color="auto" w:frame="1"/>
+        </w:rPr>
+        <w:t xml:space="preserve"> </w:t>
+      </w:r>
+      <w:proofErr w:type="spellStart"/>
+      <w:r>
+        <w:rPr>
+          <w:rStyle w:val="Strong"/>
+          <w:rFonts w:ascii="Segoe UI" w:hAnsi="Segoe UI" w:cs="Segoe UI"/>
+          <w:color w:val="CCCCCC"/>
+          <w:sz w:val="20"/>
+          <w:szCs w:val="20"/>
+          <w:bdr w:val="single" w:sz="2" w:space="0" w:color="auto" w:frame="1"/>
+        </w:rPr>
+        <w:t>chahiye</w:t>
+      </w:r>
+      <w:proofErr w:type="spellEnd"/>
+      <w:r>
+        <w:rPr>
+          <w:rFonts w:ascii="Segoe UI" w:hAnsi="Segoe UI" w:cs="Segoe UI"/>
+          <w:color w:val="CCCCCC"/>
+          <w:sz w:val="20"/>
+          <w:szCs w:val="20"/>
+        </w:rPr>
+        <w:t>:</w:t>
+      </w:r>
+    </w:p>
+    <w:p>
+      <w:pPr>
+        <w:pStyle w:val="HTMLPreformatted"/>
+        <w:pBdr>
+          <w:top w:val="single" w:sz="2" w:space="0" w:color="auto"/>
+          <w:left w:val="single" w:sz="2" w:space="0" w:color="auto"/>
+          <w:bottom w:val="single" w:sz="2" w:space="0" w:color="auto"/>
+          <w:right w:val="single" w:sz="2" w:space="0" w:color="auto"/>
+        </w:pBdr>
+        <w:shd w:val="clear" w:color="auto" w:fill="181818"/>
+        <w:rPr>
+          <w:rFonts w:ascii="Arial" w:hAnsi="Arial" w:cs="Arial"/>
+          <w:color w:val="CCCCCC"/>
+        </w:rPr>
+      </w:pPr>
+      <w:r>
+        <w:rPr>
+          <w:rFonts w:ascii="Arial" w:hAnsi="Arial" w:cs="Arial"/>
+          <w:color w:val="CCCCCC"/>
+        </w:rPr>
+        <w:t>text</w:t>
+      </w:r>
+    </w:p>
+    <w:p>
+      <w:pPr>
+        <w:pStyle w:val="HTMLPreformatted"/>
+        <w:pBdr>
+          <w:top w:val="single" w:sz="2" w:space="0" w:color="auto"/>
+          <w:left w:val="single" w:sz="2" w:space="0" w:color="auto"/>
+          <w:bottom w:val="single" w:sz="2" w:space="0" w:color="auto"/>
+          <w:right w:val="single" w:sz="2" w:space="0" w:color="auto"/>
+        </w:pBdr>
+        <w:shd w:val="clear" w:color="auto" w:fill="181818"/>
+        <w:rPr>
+          <w:color w:val="CCCCCC"/>
+        </w:rPr>
+      </w:pPr>
+      <w:r>
+        <w:rPr>
+          <w:rStyle w:val="mtk1"/>
+          <w:color w:val="CCCCCC"/>
+          <w:bdr w:val="single" w:sz="2" w:space="0" w:color="auto" w:frame="1"/>
+        </w:rPr>
+        <w:t>http://localhost:8080</w:t>
+      </w:r>
+    </w:p>
+    <w:p>
+      <w:r>
+        <w:pict>
+          <v:rect id="_x0000_i1029" style="width:180pt;height:.75pt" o:hrpct="0" o:hralign="center" o:hrstd="t" o:hr="t" fillcolor="#a0a0a0" stroked="f"/>
+        </w:pict>
+      </w:r>
+    </w:p>
+    <w:p>
+      <w:pPr>
+        <w:pStyle w:val="Heading3"/>
+        <w:pBdr>
+          <w:top w:val="single" w:sz="2" w:space="0" w:color="auto"/>
+          <w:left w:val="single" w:sz="2" w:space="0" w:color="auto"/>
+          <w:bottom w:val="single" w:sz="2" w:space="0" w:color="auto"/>
+          <w:right w:val="single" w:sz="2" w:space="0" w:color="auto"/>
+        </w:pBdr>
+        <w:shd w:val="clear" w:color="auto" w:fill="181818"/>
+        <w:rPr>
+          <w:rFonts w:ascii="Segoe UI" w:hAnsi="Segoe UI" w:cs="Segoe UI"/>
+          <w:b w:val="0"/>
+          <w:bCs w:val="0"/>
+          <w:color w:val="CCCCCC"/>
+        </w:rPr>
+      </w:pPr>
+      <w:r>
+        <w:rPr>
+          <w:rFonts w:ascii="Segoe UI" w:hAnsi="Segoe UI" w:cs="Segoe UI"/>
+          <w:b w:val="0"/>
+          <w:bCs w:val="0"/>
+          <w:color w:val="CCCCCC"/>
+        </w:rPr>
+        <w:t xml:space="preserve">2. Spring Boot Server Start </w:t>
+      </w:r>
+      <w:proofErr w:type="spellStart"/>
+      <w:r>
+        <w:rPr>
+          <w:rFonts w:ascii="Segoe UI" w:hAnsi="Segoe UI" w:cs="Segoe UI"/>
+          <w:b w:val="0"/>
+          <w:bCs w:val="0"/>
+          <w:color w:val="CCCCCC"/>
+        </w:rPr>
+        <w:t>kar</w:t>
+      </w:r>
+      <w:proofErr w:type="spellEnd"/>
+      <w:r>
+        <w:rPr>
+          <w:rFonts w:ascii="Segoe UI" w:hAnsi="Segoe UI" w:cs="Segoe UI"/>
+          <w:b w:val="0"/>
+          <w:bCs w:val="0"/>
+          <w:color w:val="CCCCCC"/>
+        </w:rPr>
+        <w:t xml:space="preserve"> </w:t>
+      </w:r>
+      <w:proofErr w:type="spellStart"/>
+      <w:r>
+        <w:rPr>
+          <w:rFonts w:ascii="Segoe UI" w:hAnsi="Segoe UI" w:cs="Segoe UI"/>
+          <w:b w:val="0"/>
+          <w:bCs w:val="0"/>
+          <w:color w:val="CCCCCC"/>
+        </w:rPr>
+        <w:t>diya</w:t>
+      </w:r>
+      <w:proofErr w:type="spellEnd"/>
+      <w:r>
+        <w:rPr>
+          <w:rFonts w:ascii="Segoe UI" w:hAnsi="Segoe UI" w:cs="Segoe UI"/>
+          <w:b w:val="0"/>
+          <w:bCs w:val="0"/>
+          <w:color w:val="CCCCCC"/>
+        </w:rPr>
+        <w:t xml:space="preserve"> </w:t>
+      </w:r>
+      <w:proofErr w:type="spellStart"/>
+      <w:r>
+        <w:rPr>
+          <w:rFonts w:ascii="Segoe UI" w:hAnsi="Segoe UI" w:cs="Segoe UI"/>
+          <w:b w:val="0"/>
+          <w:bCs w:val="0"/>
+          <w:color w:val="CCCCCC"/>
+        </w:rPr>
+        <w:t>gaya</w:t>
+      </w:r>
+      <w:proofErr w:type="spellEnd"/>
+      <w:r>
+        <w:rPr>
+          <w:rFonts w:ascii="Segoe UI" w:hAnsi="Segoe UI" w:cs="Segoe UI"/>
+          <w:b w:val="0"/>
+          <w:bCs w:val="0"/>
+          <w:color w:val="CCCCCC"/>
+        </w:rPr>
+        <w:t xml:space="preserve"> </w:t>
+      </w:r>
+      <w:proofErr w:type="spellStart"/>
+      <w:r>
+        <w:rPr>
+          <w:rFonts w:ascii="Segoe UI" w:hAnsi="Segoe UI" w:cs="Segoe UI"/>
+          <w:b w:val="0"/>
+          <w:bCs w:val="0"/>
+          <w:color w:val="CCCCCC"/>
+        </w:rPr>
+        <w:t>hai</w:t>
+      </w:r>
+      <w:proofErr w:type="spellEnd"/>
+    </w:p>
+    <w:p>
+      <w:pPr>
+        <w:pStyle w:val="NormalWeb"/>
+        <w:pBdr>
+          <w:top w:val="single" w:sz="2" w:space="0" w:color="auto"/>
+          <w:left w:val="single" w:sz="2" w:space="0" w:color="auto"/>
+          <w:bottom w:val="single" w:sz="2" w:space="0" w:color="auto"/>
+          <w:right w:val="single" w:sz="2" w:space="0" w:color="auto"/>
+        </w:pBdr>
+        <w:shd w:val="clear" w:color="auto" w:fill="181818"/>
+        <w:spacing w:before="0" w:beforeAutospacing="0" w:after="0" w:afterAutospacing="0"/>
+        <w:rPr>
+          <w:rFonts w:ascii="Segoe UI" w:hAnsi="Segoe UI" w:cs="Segoe UI"/>
+          <w:color w:val="CCCCCC"/>
+          <w:sz w:val="20"/>
+          <w:szCs w:val="20"/>
+        </w:rPr>
+      </w:pPr>
+      <w:r>
+        <w:rPr>
+          <w:rFonts w:ascii="Segoe UI" w:hAnsi="Segoe UI" w:cs="Segoe UI"/>
+          <w:color w:val="CCCCCC"/>
+          <w:sz w:val="20"/>
+          <w:szCs w:val="20"/>
+        </w:rPr>
+        <w:t xml:space="preserve">Application properties me database configuration </w:t>
+      </w:r>
+      <w:proofErr w:type="spellStart"/>
+      <w:r>
+        <w:rPr>
+          <w:rFonts w:ascii="Segoe UI" w:hAnsi="Segoe UI" w:cs="Segoe UI"/>
+          <w:color w:val="CCCCCC"/>
+          <w:sz w:val="20"/>
+          <w:szCs w:val="20"/>
+        </w:rPr>
+        <w:t>ka</w:t>
+      </w:r>
+      <w:proofErr w:type="spellEnd"/>
+      <w:r>
+        <w:rPr>
+          <w:rFonts w:ascii="Segoe UI" w:hAnsi="Segoe UI" w:cs="Segoe UI"/>
+          <w:color w:val="CCCCCC"/>
+          <w:sz w:val="20"/>
+          <w:szCs w:val="20"/>
+        </w:rPr>
+        <w:t xml:space="preserve"> </w:t>
+      </w:r>
+      <w:proofErr w:type="spellStart"/>
+      <w:r>
+        <w:rPr>
+          <w:rFonts w:ascii="Segoe UI" w:hAnsi="Segoe UI" w:cs="Segoe UI"/>
+          <w:color w:val="CCCCCC"/>
+          <w:sz w:val="20"/>
+          <w:szCs w:val="20"/>
+        </w:rPr>
+        <w:t>chhota</w:t>
+      </w:r>
+      <w:proofErr w:type="spellEnd"/>
+      <w:r>
+        <w:rPr>
+          <w:rFonts w:ascii="Segoe UI" w:hAnsi="Segoe UI" w:cs="Segoe UI"/>
+          <w:color w:val="CCCCCC"/>
+          <w:sz w:val="20"/>
+          <w:szCs w:val="20"/>
+        </w:rPr>
+        <w:t xml:space="preserve"> </w:t>
+      </w:r>
+      <w:proofErr w:type="spellStart"/>
+      <w:r>
+        <w:rPr>
+          <w:rFonts w:ascii="Segoe UI" w:hAnsi="Segoe UI" w:cs="Segoe UI"/>
+          <w:color w:val="CCCCCC"/>
+          <w:sz w:val="20"/>
+          <w:szCs w:val="20"/>
+        </w:rPr>
+        <w:t>sa</w:t>
+      </w:r>
+      <w:proofErr w:type="spellEnd"/>
+      <w:r>
+        <w:rPr>
+          <w:rFonts w:ascii="Segoe UI" w:hAnsi="Segoe UI" w:cs="Segoe UI"/>
+          <w:color w:val="CCCCCC"/>
+          <w:sz w:val="20"/>
+          <w:szCs w:val="20"/>
+        </w:rPr>
+        <w:t xml:space="preserve"> issue </w:t>
+      </w:r>
+      <w:proofErr w:type="spellStart"/>
+      <w:r>
+        <w:rPr>
+          <w:rFonts w:ascii="Segoe UI" w:hAnsi="Segoe UI" w:cs="Segoe UI"/>
+          <w:color w:val="CCCCCC"/>
+          <w:sz w:val="20"/>
+          <w:szCs w:val="20"/>
+        </w:rPr>
+        <w:t>tha</w:t>
+      </w:r>
+      <w:proofErr w:type="spellEnd"/>
+      <w:r>
+        <w:rPr>
+          <w:rFonts w:ascii="Segoe UI" w:hAnsi="Segoe UI" w:cs="Segoe UI"/>
+          <w:color w:val="CCCCCC"/>
+          <w:sz w:val="20"/>
+          <w:szCs w:val="20"/>
+        </w:rPr>
+        <w:t xml:space="preserve">, </w:t>
+      </w:r>
+      <w:proofErr w:type="spellStart"/>
+      <w:r>
+        <w:rPr>
+          <w:rFonts w:ascii="Segoe UI" w:hAnsi="Segoe UI" w:cs="Segoe UI"/>
+          <w:color w:val="CCCCCC"/>
+          <w:sz w:val="20"/>
+          <w:szCs w:val="20"/>
+        </w:rPr>
+        <w:t>jise</w:t>
+      </w:r>
+      <w:proofErr w:type="spellEnd"/>
+      <w:r>
+        <w:rPr>
+          <w:rFonts w:ascii="Segoe UI" w:hAnsi="Segoe UI" w:cs="Segoe UI"/>
+          <w:color w:val="CCCCCC"/>
+          <w:sz w:val="20"/>
+          <w:szCs w:val="20"/>
+        </w:rPr>
+        <w:t xml:space="preserve"> fix </w:t>
+      </w:r>
+      <w:proofErr w:type="spellStart"/>
+      <w:r>
+        <w:rPr>
+          <w:rFonts w:ascii="Segoe UI" w:hAnsi="Segoe UI" w:cs="Segoe UI"/>
+          <w:color w:val="CCCCCC"/>
+          <w:sz w:val="20"/>
+          <w:szCs w:val="20"/>
+        </w:rPr>
+        <w:t>karke</w:t>
+      </w:r>
+      <w:proofErr w:type="spellEnd"/>
+      <w:r>
+        <w:rPr>
+          <w:rFonts w:ascii="Segoe UI" w:hAnsi="Segoe UI" w:cs="Segoe UI"/>
+          <w:color w:val="CCCCCC"/>
+          <w:sz w:val="20"/>
+          <w:szCs w:val="20"/>
+        </w:rPr>
+        <w:t xml:space="preserve"> server start </w:t>
+      </w:r>
+      <w:proofErr w:type="spellStart"/>
+      <w:r>
+        <w:rPr>
+          <w:rFonts w:ascii="Segoe UI" w:hAnsi="Segoe UI" w:cs="Segoe UI"/>
+          <w:color w:val="CCCCCC"/>
+          <w:sz w:val="20"/>
+          <w:szCs w:val="20"/>
+        </w:rPr>
+        <w:t>kar</w:t>
+      </w:r>
+      <w:proofErr w:type="spellEnd"/>
+      <w:r>
+        <w:rPr>
+          <w:rFonts w:ascii="Segoe UI" w:hAnsi="Segoe UI" w:cs="Segoe UI"/>
+          <w:color w:val="CCCCCC"/>
+          <w:sz w:val="20"/>
+          <w:szCs w:val="20"/>
+        </w:rPr>
+        <w:t xml:space="preserve"> </w:t>
+      </w:r>
+      <w:proofErr w:type="spellStart"/>
+      <w:r>
+        <w:rPr>
+          <w:rFonts w:ascii="Segoe UI" w:hAnsi="Segoe UI" w:cs="Segoe UI"/>
+          <w:color w:val="CCCCCC"/>
+          <w:sz w:val="20"/>
+          <w:szCs w:val="20"/>
+        </w:rPr>
+        <w:t>diya</w:t>
+      </w:r>
+      <w:proofErr w:type="spellEnd"/>
+      <w:r>
+        <w:rPr>
+          <w:rFonts w:ascii="Segoe UI" w:hAnsi="Segoe UI" w:cs="Segoe UI"/>
+          <w:color w:val="CCCCCC"/>
+          <w:sz w:val="20"/>
+          <w:szCs w:val="20"/>
+        </w:rPr>
+        <w:t xml:space="preserve"> </w:t>
+      </w:r>
+      <w:proofErr w:type="spellStart"/>
+      <w:r>
+        <w:rPr>
+          <w:rFonts w:ascii="Segoe UI" w:hAnsi="Segoe UI" w:cs="Segoe UI"/>
+          <w:color w:val="CCCCCC"/>
+          <w:sz w:val="20"/>
+          <w:szCs w:val="20"/>
+        </w:rPr>
+        <w:t>gaya</w:t>
+      </w:r>
+      <w:proofErr w:type="spellEnd"/>
+      <w:r>
+        <w:rPr>
+          <w:rFonts w:ascii="Segoe UI" w:hAnsi="Segoe UI" w:cs="Segoe UI"/>
+          <w:color w:val="CCCCCC"/>
+          <w:sz w:val="20"/>
+          <w:szCs w:val="20"/>
+        </w:rPr>
+        <w:t xml:space="preserve"> </w:t>
+      </w:r>
+      <w:proofErr w:type="spellStart"/>
+      <w:r>
+        <w:rPr>
+          <w:rFonts w:ascii="Segoe UI" w:hAnsi="Segoe UI" w:cs="Segoe UI"/>
+          <w:color w:val="CCCCCC"/>
+          <w:sz w:val="20"/>
+          <w:szCs w:val="20"/>
+        </w:rPr>
+        <w:t>hai</w:t>
+      </w:r>
+      <w:proofErr w:type="spellEnd"/>
+      <w:r>
+        <w:rPr>
+          <w:rFonts w:ascii="Segoe UI" w:hAnsi="Segoe UI" w:cs="Segoe UI"/>
+          <w:color w:val="CCCCCC"/>
+          <w:sz w:val="20"/>
+          <w:szCs w:val="20"/>
+        </w:rPr>
+        <w:t>:</w:t>
+      </w:r>
+    </w:p>
+    <w:p>
+      <w:pPr>
+        <w:pStyle w:val="HTMLPreformatted"/>
+        <w:pBdr>
+          <w:top w:val="single" w:sz="2" w:space="0" w:color="auto"/>
+          <w:left w:val="single" w:sz="2" w:space="0" w:color="auto"/>
+          <w:bottom w:val="single" w:sz="2" w:space="0" w:color="auto"/>
+          <w:right w:val="single" w:sz="2" w:space="0" w:color="auto"/>
+        </w:pBdr>
+        <w:shd w:val="clear" w:color="auto" w:fill="181818"/>
+        <w:rPr>
+          <w:rFonts w:ascii="Arial" w:hAnsi="Arial" w:cs="Arial"/>
+          <w:color w:val="CCCCCC"/>
+        </w:rPr>
+      </w:pPr>
+      <w:r>
+        <w:rPr>
+          <w:rFonts w:ascii="Arial" w:hAnsi="Arial" w:cs="Arial"/>
+          <w:color w:val="CCCCCC"/>
+        </w:rPr>
+        <w:t>text</w:t>
+      </w:r>
+    </w:p>
+    <w:p>
+      <w:pPr>
+        <w:pStyle w:val="HTMLPreformatted"/>
+        <w:pBdr>
+          <w:top w:val="single" w:sz="2" w:space="0" w:color="auto"/>
+          <w:left w:val="single" w:sz="2" w:space="0" w:color="auto"/>
+          <w:bottom w:val="single" w:sz="2" w:space="0" w:color="auto"/>
+          <w:right w:val="single" w:sz="2" w:space="0" w:color="auto"/>
+        </w:pBdr>
+        <w:shd w:val="clear" w:color="auto" w:fill="181818"/>
+        <w:rPr>
+          <w:color w:val="CCCCCC"/>
+        </w:rPr>
+      </w:pPr>
+      <w:r>
+        <w:rPr>
+          <w:rStyle w:val="mtk1"/>
+          <w:color w:val="CCCCCC"/>
+          <w:bdr w:val="single" w:sz="2" w:space="0" w:color="auto" w:frame="1"/>
+        </w:rPr>
+        <w:t>=======================================================</w:t>
+      </w:r>
+    </w:p>
+    <w:p>
+      <w:pPr>
+        <w:pStyle w:val="HTMLPreformatted"/>
+        <w:pBdr>
+          <w:top w:val="single" w:sz="2" w:space="0" w:color="auto"/>
+          <w:left w:val="single" w:sz="2" w:space="0" w:color="auto"/>
+          <w:bottom w:val="single" w:sz="2" w:space="0" w:color="auto"/>
+          <w:right w:val="single" w:sz="2" w:space="0" w:color="auto"/>
+        </w:pBdr>
+        <w:shd w:val="clear" w:color="auto" w:fill="181818"/>
+        <w:rPr>
+          <w:color w:val="CCCCCC"/>
+        </w:rPr>
+      </w:pPr>
+      <w:r>
+        <w:rPr>
+          <w:rStyle w:val="mtk1"/>
+          <w:color w:val="CCCCCC"/>
+          <w:bdr w:val="single" w:sz="2" w:space="0" w:color="auto" w:frame="1"/>
+        </w:rPr>
+        <w:t xml:space="preserve">  PATROL TRACKER MOBILE APP STARTED SUCCESSFULLY!</w:t>
+      </w:r>
+    </w:p>
+    <w:p>
+      <w:pPr>
+        <w:pStyle w:val="HTMLPreformatted"/>
+        <w:pBdr>
+          <w:top w:val="single" w:sz="2" w:space="0" w:color="auto"/>
+          <w:left w:val="single" w:sz="2" w:space="0" w:color="auto"/>
+          <w:bottom w:val="single" w:sz="2" w:space="0" w:color="auto"/>
+          <w:right w:val="single" w:sz="2" w:space="0" w:color="auto"/>
+        </w:pBdr>
+        <w:shd w:val="clear" w:color="auto" w:fill="181818"/>
+        <w:rPr>
+          <w:color w:val="CCCCCC"/>
+        </w:rPr>
+      </w:pPr>
+      <w:r>
+        <w:rPr>
+          <w:rStyle w:val="mtk1"/>
+          <w:color w:val="CCCCCC"/>
+          <w:bdr w:val="single" w:sz="2" w:space="0" w:color="auto" w:frame="1"/>
+        </w:rPr>
+        <w:t xml:space="preserve">  Access App UI: http://localhost:8080</w:t>
+      </w:r>
+    </w:p>
+    <w:p>
+      <w:pPr>
+        <w:pStyle w:val="HTMLPreformatted"/>
+        <w:pBdr>
+          <w:top w:val="single" w:sz="2" w:space="0" w:color="auto"/>
+          <w:left w:val="single" w:sz="2" w:space="0" w:color="auto"/>
+          <w:bottom w:val="single" w:sz="2" w:space="0" w:color="auto"/>
+          <w:right w:val="single" w:sz="2" w:space="0" w:color="auto"/>
+        </w:pBdr>
+        <w:shd w:val="clear" w:color="auto" w:fill="181818"/>
+        <w:rPr>
+          <w:color w:val="CCCCCC"/>
+        </w:rPr>
+      </w:pPr>
+      <w:r>
+        <w:rPr>
+          <w:rStyle w:val="mtk1"/>
+          <w:color w:val="CCCCCC"/>
+          <w:bdr w:val="single" w:sz="2" w:space="0" w:color="auto" w:frame="1"/>
+        </w:rPr>
+        <w:lastRenderedPageBreak/>
+        <w:t xml:space="preserve">  H2 Console:    http://localhost:8080/h2-console</w:t>
+      </w:r>
+    </w:p>
+    <w:p>
+      <w:pPr>
+        <w:pStyle w:val="HTMLPreformatted"/>
+        <w:pBdr>
+          <w:top w:val="single" w:sz="2" w:space="0" w:color="auto"/>
+          <w:left w:val="single" w:sz="2" w:space="0" w:color="auto"/>
+          <w:bottom w:val="single" w:sz="2" w:space="0" w:color="auto"/>
+          <w:right w:val="single" w:sz="2" w:space="0" w:color="auto"/>
+        </w:pBdr>
+        <w:shd w:val="clear" w:color="auto" w:fill="181818"/>
+        <w:rPr>
+          <w:color w:val="CCCCCC"/>
+        </w:rPr>
+      </w:pPr>
+      <w:r>
+        <w:rPr>
+          <w:rStyle w:val="mtk1"/>
+          <w:color w:val="CCCCCC"/>
+          <w:bdr w:val="single" w:sz="2" w:space="0" w:color="auto" w:frame="1"/>
+        </w:rPr>
+        <w:t>=======================================================</w:t>
+      </w:r>
+    </w:p>
+    <w:p>
+      <w:r>
+        <w:pict>
+          <v:rect id="_x0000_i1030" style="width:180pt;height:.75pt" o:hrpct="0" o:hralign="center" o:hrstd="t" o:hr="t" fillcolor="#a0a0a0" stroked="f"/>
+        </w:pict>
+      </w:r>
+    </w:p>
+    <w:p>
+      <w:pPr>
+        <w:pStyle w:val="NormalWeb"/>
+        <w:pBdr>
+          <w:top w:val="single" w:sz="2" w:space="0" w:color="auto"/>
+          <w:left w:val="single" w:sz="2" w:space="0" w:color="auto"/>
+          <w:bottom w:val="single" w:sz="2" w:space="0" w:color="auto"/>
+          <w:right w:val="single" w:sz="2" w:space="0" w:color="auto"/>
+        </w:pBdr>
+        <w:shd w:val="clear" w:color="auto" w:fill="181818"/>
+        <w:spacing w:before="0" w:beforeAutospacing="0" w:after="0" w:afterAutospacing="0"/>
+        <w:rPr>
+          <w:rFonts w:ascii="Segoe UI" w:hAnsi="Segoe UI" w:cs="Segoe UI"/>
+          <w:color w:val="CCCCCC"/>
+          <w:sz w:val="20"/>
+          <w:szCs w:val="20"/>
+        </w:rPr>
+      </w:pPr>
+      <w:r>
+        <w:rPr>
+          <w:rFonts w:ascii="Segoe UI" w:hAnsi="Segoe UI" w:cs="Segoe UI"/>
+          <w:color w:val="CCCCCC"/>
+          <w:sz w:val="20"/>
+          <w:szCs w:val="20"/>
+        </w:rPr>
+        <w:t xml:space="preserve">🌐 </w:t>
+      </w:r>
+      <w:proofErr w:type="spellStart"/>
+      <w:r>
+        <w:rPr>
+          <w:rFonts w:ascii="Segoe UI" w:hAnsi="Segoe UI" w:cs="Segoe UI"/>
+          <w:color w:val="CCCCCC"/>
+          <w:sz w:val="20"/>
+          <w:szCs w:val="20"/>
+        </w:rPr>
+        <w:t>Ab</w:t>
+      </w:r>
+      <w:proofErr w:type="spellEnd"/>
+      <w:r>
+        <w:rPr>
+          <w:rFonts w:ascii="Segoe UI" w:hAnsi="Segoe UI" w:cs="Segoe UI"/>
+          <w:color w:val="CCCCCC"/>
+          <w:sz w:val="20"/>
+          <w:szCs w:val="20"/>
+        </w:rPr>
+        <w:t xml:space="preserve"> </w:t>
+      </w:r>
+      <w:proofErr w:type="spellStart"/>
+      <w:r>
+        <w:rPr>
+          <w:rFonts w:ascii="Segoe UI" w:hAnsi="Segoe UI" w:cs="Segoe UI"/>
+          <w:color w:val="CCCCCC"/>
+          <w:sz w:val="20"/>
+          <w:szCs w:val="20"/>
+        </w:rPr>
+        <w:t>aap</w:t>
+      </w:r>
+      <w:proofErr w:type="spellEnd"/>
+      <w:r>
+        <w:rPr>
+          <w:rFonts w:ascii="Segoe UI" w:hAnsi="Segoe UI" w:cs="Segoe UI"/>
+          <w:color w:val="CCCCCC"/>
+          <w:sz w:val="20"/>
+          <w:szCs w:val="20"/>
+        </w:rPr>
+        <w:t xml:space="preserve"> </w:t>
+      </w:r>
+      <w:proofErr w:type="spellStart"/>
+      <w:r>
+        <w:rPr>
+          <w:rFonts w:ascii="Segoe UI" w:hAnsi="Segoe UI" w:cs="Segoe UI"/>
+          <w:color w:val="CCCCCC"/>
+          <w:sz w:val="20"/>
+          <w:szCs w:val="20"/>
+        </w:rPr>
+        <w:t>apne</w:t>
+      </w:r>
+      <w:proofErr w:type="spellEnd"/>
+      <w:r>
+        <w:rPr>
+          <w:rFonts w:ascii="Segoe UI" w:hAnsi="Segoe UI" w:cs="Segoe UI"/>
+          <w:color w:val="CCCCCC"/>
+          <w:sz w:val="20"/>
+          <w:szCs w:val="20"/>
+        </w:rPr>
+        <w:t xml:space="preserve"> browser me </w:t>
+      </w:r>
+      <w:hyperlink r:id="rId10" w:history="1">
+        <w:r>
+          <w:rPr>
+            <w:rStyle w:val="Hyperlink"/>
+            <w:rFonts w:ascii="Segoe UI" w:hAnsi="Segoe UI" w:cs="Segoe UI"/>
+            <w:b/>
+            <w:bCs/>
+            <w:color w:val="4DAAFC"/>
+            <w:sz w:val="20"/>
+            <w:szCs w:val="20"/>
+            <w:bdr w:val="single" w:sz="2" w:space="0" w:color="auto" w:frame="1"/>
+          </w:rPr>
+          <w:t>http://localhost:8080</w:t>
+        </w:r>
+      </w:hyperlink>
+      <w:r>
+        <w:rPr>
+          <w:rFonts w:ascii="Segoe UI" w:hAnsi="Segoe UI" w:cs="Segoe UI"/>
+          <w:color w:val="CCCCCC"/>
+          <w:sz w:val="20"/>
+          <w:szCs w:val="20"/>
+        </w:rPr>
+        <w:t xml:space="preserve"> open </w:t>
+      </w:r>
+      <w:proofErr w:type="spellStart"/>
+      <w:r>
+        <w:rPr>
+          <w:rFonts w:ascii="Segoe UI" w:hAnsi="Segoe UI" w:cs="Segoe UI"/>
+          <w:color w:val="CCCCCC"/>
+          <w:sz w:val="20"/>
+          <w:szCs w:val="20"/>
+        </w:rPr>
+        <w:t>karke</w:t>
+      </w:r>
+      <w:proofErr w:type="spellEnd"/>
+      <w:r>
+        <w:rPr>
+          <w:rFonts w:ascii="Segoe UI" w:hAnsi="Segoe UI" w:cs="Segoe UI"/>
+          <w:color w:val="CCCCCC"/>
+          <w:sz w:val="20"/>
+          <w:szCs w:val="20"/>
+        </w:rPr>
+        <w:t xml:space="preserve"> </w:t>
+      </w:r>
+      <w:proofErr w:type="spellStart"/>
+      <w:r>
+        <w:rPr>
+          <w:rFonts w:ascii="Segoe UI" w:hAnsi="Segoe UI" w:cs="Segoe UI"/>
+          <w:color w:val="CCCCCC"/>
+          <w:sz w:val="20"/>
+          <w:szCs w:val="20"/>
+        </w:rPr>
+        <w:t>dekhein</w:t>
+      </w:r>
+      <w:proofErr w:type="spellEnd"/>
+      <w:r>
+        <w:rPr>
+          <w:rFonts w:ascii="Segoe UI" w:hAnsi="Segoe UI" w:cs="Segoe UI"/>
+          <w:color w:val="CCCCCC"/>
+          <w:sz w:val="20"/>
+          <w:szCs w:val="20"/>
+        </w:rPr>
+        <w:t xml:space="preserve">! </w:t>
+      </w:r>
+      <w:proofErr w:type="spellStart"/>
+      <w:r>
+        <w:rPr>
+          <w:rFonts w:ascii="Segoe UI" w:hAnsi="Segoe UI" w:cs="Segoe UI"/>
+          <w:color w:val="CCCCCC"/>
+          <w:sz w:val="20"/>
+          <w:szCs w:val="20"/>
+        </w:rPr>
+        <w:t>Aapka</w:t>
+      </w:r>
+      <w:proofErr w:type="spellEnd"/>
+      <w:r>
+        <w:rPr>
+          <w:rFonts w:ascii="Segoe UI" w:hAnsi="Segoe UI" w:cs="Segoe UI"/>
+          <w:color w:val="CCCCCC"/>
+          <w:sz w:val="20"/>
+          <w:szCs w:val="20"/>
+        </w:rPr>
+        <w:t> </w:t>
+      </w:r>
+      <w:r>
+        <w:rPr>
+          <w:rStyle w:val="Strong"/>
+          <w:rFonts w:ascii="Segoe UI" w:hAnsi="Segoe UI" w:cs="Segoe UI"/>
+          <w:color w:val="CCCCCC"/>
+          <w:sz w:val="20"/>
+          <w:szCs w:val="20"/>
+          <w:bdr w:val="single" w:sz="2" w:space="0" w:color="auto" w:frame="1"/>
+        </w:rPr>
+        <w:t>Patrol Tracker</w:t>
+      </w:r>
+      <w:r>
+        <w:rPr>
+          <w:rFonts w:ascii="Segoe UI" w:hAnsi="Segoe UI" w:cs="Segoe UI"/>
+          <w:color w:val="CCCCCC"/>
+          <w:sz w:val="20"/>
+          <w:szCs w:val="20"/>
+        </w:rPr>
+        <w:t xml:space="preserve"> dashboard completely working </w:t>
+      </w:r>
+      <w:proofErr w:type="spellStart"/>
+      <w:r>
+        <w:rPr>
+          <w:rFonts w:ascii="Segoe UI" w:hAnsi="Segoe UI" w:cs="Segoe UI"/>
+          <w:color w:val="CCCCCC"/>
+          <w:sz w:val="20"/>
+          <w:szCs w:val="20"/>
+        </w:rPr>
+        <w:t>dikhai</w:t>
+      </w:r>
+      <w:proofErr w:type="spellEnd"/>
+      <w:r>
+        <w:rPr>
+          <w:rFonts w:ascii="Segoe UI" w:hAnsi="Segoe UI" w:cs="Segoe UI"/>
+          <w:color w:val="CCCCCC"/>
+          <w:sz w:val="20"/>
+          <w:szCs w:val="20"/>
+        </w:rPr>
+        <w:t xml:space="preserve"> </w:t>
+      </w:r>
+      <w:proofErr w:type="spellStart"/>
+      <w:r>
+        <w:rPr>
+          <w:rFonts w:ascii="Segoe UI" w:hAnsi="Segoe UI" w:cs="Segoe UI"/>
+          <w:color w:val="CCCCCC"/>
+          <w:sz w:val="20"/>
+          <w:szCs w:val="20"/>
+        </w:rPr>
+        <w:t>dega</w:t>
+      </w:r>
+      <w:proofErr w:type="spellEnd"/>
+      <w:r>
+        <w:rPr>
+          <w:rFonts w:ascii="Segoe UI" w:hAnsi="Segoe UI" w:cs="Segoe UI"/>
+          <w:color w:val="CCCCCC"/>
+          <w:sz w:val="20"/>
+          <w:szCs w:val="20"/>
+        </w:rPr>
+        <w:t>.</w:t>
+      </w:r>
+    </w:p>
+    <w:p>
+      <w:bookmarkStart w:id="0" w:name="_GoBack"/>
+      <w:bookmarkEnd w:id="0"/>
+    </w:p>
     <w:sectPr>
       <w:pgSz w:w="11906" w:h="16838"/>
       <w:pgMar w:top="1440" w:right="476" w:bottom="1440" w:left="1440" w:header="708" w:footer="708" w:gutter="0"/>
@@ -2974,7 +4503,6 @@
     <w:name w:val="Hyperlink"/>
     <w:basedOn w:val="DefaultParagraphFont"/>
     <w:uiPriority w:val="99"/>
-    <w:semiHidden/>
     <w:unhideWhenUsed/>
     <w:rsid w:val="00D90071"/>
     <w:rPr>
@@ -3010,6 +4538,61 @@
       <w:i/>
       <w:iCs/>
     </w:rPr>
+  </w:style>
+  <w:style w:type="paragraph" w:styleId="HTMLPreformatted">
+    <w:name w:val="HTML Preformatted"/>
+    <w:basedOn w:val="Normal"/>
+    <w:link w:val="HTMLPreformattedChar"/>
+    <w:uiPriority w:val="99"/>
+    <w:semiHidden/>
+    <w:unhideWhenUsed/>
+    <w:rsid w:val="000E460E"/>
+    <w:pPr>
+      <w:tabs>
+        <w:tab w:val="left" w:pos="916"/>
+        <w:tab w:val="left" w:pos="1832"/>
+        <w:tab w:val="left" w:pos="2748"/>
+        <w:tab w:val="left" w:pos="3664"/>
+        <w:tab w:val="left" w:pos="4580"/>
+        <w:tab w:val="left" w:pos="5496"/>
+        <w:tab w:val="left" w:pos="6412"/>
+        <w:tab w:val="left" w:pos="7328"/>
+        <w:tab w:val="left" w:pos="8244"/>
+        <w:tab w:val="left" w:pos="9160"/>
+        <w:tab w:val="left" w:pos="10076"/>
+        <w:tab w:val="left" w:pos="10992"/>
+        <w:tab w:val="left" w:pos="11908"/>
+        <w:tab w:val="left" w:pos="12824"/>
+        <w:tab w:val="left" w:pos="13740"/>
+        <w:tab w:val="left" w:pos="14656"/>
+      </w:tabs>
+      <w:spacing w:after="0" w:line="240" w:lineRule="auto"/>
+    </w:pPr>
+    <w:rPr>
+      <w:rFonts w:ascii="Courier New" w:eastAsia="Times New Roman" w:hAnsi="Courier New" w:cs="Courier New"/>
+      <w:sz w:val="20"/>
+      <w:szCs w:val="20"/>
+      <w:lang w:eastAsia="en-IN" w:bidi="hi-IN"/>
+    </w:rPr>
+  </w:style>
+  <w:style w:type="character" w:customStyle="1" w:styleId="HTMLPreformattedChar">
+    <w:name w:val="HTML Preformatted Char"/>
+    <w:basedOn w:val="DefaultParagraphFont"/>
+    <w:link w:val="HTMLPreformatted"/>
+    <w:uiPriority w:val="99"/>
+    <w:semiHidden/>
+    <w:rsid w:val="000E460E"/>
+    <w:rPr>
+      <w:rFonts w:ascii="Courier New" w:eastAsia="Times New Roman" w:hAnsi="Courier New" w:cs="Courier New"/>
+      <w:sz w:val="20"/>
+      <w:szCs w:val="20"/>
+      <w:lang w:eastAsia="en-IN" w:bidi="hi-IN"/>
+    </w:rPr>
+  </w:style>
+  <w:style w:type="character" w:customStyle="1" w:styleId="mtk1">
+    <w:name w:val="mtk1"/>
+    <w:basedOn w:val="DefaultParagraphFont"/>
+    <w:rsid w:val="000E460E"/>
   </w:style>
 </w:styles>
 </file>
@@ -3268,7 +4851,6 @@
     <w:name w:val="Hyperlink"/>
     <w:basedOn w:val="DefaultParagraphFont"/>
     <w:uiPriority w:val="99"/>
-    <w:semiHidden/>
     <w:unhideWhenUsed/>
     <w:rsid w:val="00D90071"/>
     <w:rPr>
@@ -3304,6 +4886,61 @@
       <w:i/>
       <w:iCs/>
     </w:rPr>
+  </w:style>
+  <w:style w:type="paragraph" w:styleId="HTMLPreformatted">
+    <w:name w:val="HTML Preformatted"/>
+    <w:basedOn w:val="Normal"/>
+    <w:link w:val="HTMLPreformattedChar"/>
+    <w:uiPriority w:val="99"/>
+    <w:semiHidden/>
+    <w:unhideWhenUsed/>
+    <w:rsid w:val="000E460E"/>
+    <w:pPr>
+      <w:tabs>
+        <w:tab w:val="left" w:pos="916"/>
+        <w:tab w:val="left" w:pos="1832"/>
+        <w:tab w:val="left" w:pos="2748"/>
+        <w:tab w:val="left" w:pos="3664"/>
+        <w:tab w:val="left" w:pos="4580"/>
+        <w:tab w:val="left" w:pos="5496"/>
+        <w:tab w:val="left" w:pos="6412"/>
+        <w:tab w:val="left" w:pos="7328"/>
+        <w:tab w:val="left" w:pos="8244"/>
+        <w:tab w:val="left" w:pos="9160"/>
+        <w:tab w:val="left" w:pos="10076"/>
+        <w:tab w:val="left" w:pos="10992"/>
+        <w:tab w:val="left" w:pos="11908"/>
+        <w:tab w:val="left" w:pos="12824"/>
+        <w:tab w:val="left" w:pos="13740"/>
+        <w:tab w:val="left" w:pos="14656"/>
+      </w:tabs>
+      <w:spacing w:after="0" w:line="240" w:lineRule="auto"/>
+    </w:pPr>
+    <w:rPr>
+      <w:rFonts w:ascii="Courier New" w:eastAsia="Times New Roman" w:hAnsi="Courier New" w:cs="Courier New"/>
+      <w:sz w:val="20"/>
+      <w:szCs w:val="20"/>
+      <w:lang w:eastAsia="en-IN" w:bidi="hi-IN"/>
+    </w:rPr>
+  </w:style>
+  <w:style w:type="character" w:customStyle="1" w:styleId="HTMLPreformattedChar">
+    <w:name w:val="HTML Preformatted Char"/>
+    <w:basedOn w:val="DefaultParagraphFont"/>
+    <w:link w:val="HTMLPreformatted"/>
+    <w:uiPriority w:val="99"/>
+    <w:semiHidden/>
+    <w:rsid w:val="000E460E"/>
+    <w:rPr>
+      <w:rFonts w:ascii="Courier New" w:eastAsia="Times New Roman" w:hAnsi="Courier New" w:cs="Courier New"/>
+      <w:sz w:val="20"/>
+      <w:szCs w:val="20"/>
+      <w:lang w:eastAsia="en-IN" w:bidi="hi-IN"/>
+    </w:rPr>
+  </w:style>
+  <w:style w:type="character" w:customStyle="1" w:styleId="mtk1">
+    <w:name w:val="mtk1"/>
+    <w:basedOn w:val="DefaultParagraphFont"/>
+    <w:rsid w:val="000E460E"/>
   </w:style>
 </w:styles>
 </file>

</xml_diff>